<commit_message>
CHLS: remove silent-drop gate on non-debug _emit calls
</commit_message>
<xml_diff>
--- a/pipeline/ArchitectureDesignAndAudit/EPIC-010_epic_and_features_V2.docx
+++ b/pipeline/ArchitectureDesignAndAudit/EPIC-010_epic_and_features_V2.docx
@@ -28,6 +28,25 @@
     <w:p>
       <w:r>
         <w:t xml:space="preserve">&lt;/skip: I’m both editing in line, so respect my </w:t>
+      </w:r>
+      <w:r>
+        <w:t xml:space="preserve">changes where you see them, and then if I have a comment that is more than an edit, I will put them into SGML tags with instructions questions comments etc. In your next iteration fix as I tell you to. If you have questions </w:t>
+      </w:r>
+      <w:proofErr w:type="spellStart"/>
+      <w:r>
+        <w:t>etc</w:t>
+      </w:r>
+      <w:proofErr w:type="spellEnd"/>
+      <w:r>
+        <w:t xml:space="preserve">, do it within the ‘agent GUI’ and not within the document’ as before I only want the JSON, nothing else when you return a doc version to me. Each time version the doc by incrementing by one. And put the old versions into the archive inside a requirements folder. For any change I make </w:t>
+      </w:r>
+      <w:proofErr w:type="spellStart"/>
+      <w:r>
+        <w:t>make</w:t>
+      </w:r>
+      <w:proofErr w:type="spellEnd"/>
+      <w:r>
+        <w:t xml:space="preserve"> sure to change it to be schema compliant if I make a mistake&gt;</w:t>
       </w:r>
     </w:p>
     <w:p>
@@ -62,25 +81,27 @@
         <w:rPr>
           <w:b/>
         </w:rPr>
-        <w:t xml:space="preserve">Name: </w:t>
+        <w:t>Name</w:t>
+      </w:r>
+      <w:proofErr w:type="gramStart"/>
+      <w:r>
+        <w:rPr>
+          <w:b/>
+        </w:rPr>
+        <w:t xml:space="preserve">: </w:t>
       </w:r>
       <w:r>
         <w:rPr>
           <w:bCs/>
         </w:rPr>
-        <w:t xml:space="preserve"> skip: </w:t>
+        <w:t xml:space="preserve"> Data</w:t>
       </w:r>
+      <w:proofErr w:type="gramEnd"/>
       <w:r>
         <w:rPr>
           <w:bCs/>
         </w:rPr>
-        <w:t>edited ‘</w:t>
-      </w:r>
-      <w:r>
-        <w:rPr>
-          <w:bCs/>
-        </w:rPr>
-        <w:t xml:space="preserve">Data </w:t>
+        <w:t xml:space="preserve"> </w:t>
       </w:r>
       <w:r>
         <w:rPr>
@@ -92,7 +113,7 @@
         <w:rPr>
           <w:bCs/>
         </w:rPr>
-        <w:t>’</w:t>
+        <w:t>: Infrastructure and business rules per pipeline</w:t>
       </w:r>
     </w:p>
     <w:p>
@@ -158,6 +179,7 @@
         <w:rPr>
           <w:color w:val="1F3864"/>
         </w:rPr>
+        <w:lastRenderedPageBreak/>
         <w:t>Feature Definitions</w:t>
       </w:r>
     </w:p>
@@ -188,7 +210,6 @@
         <w:rPr>
           <w:b/>
         </w:rPr>
-        <w:lastRenderedPageBreak/>
         <w:t xml:space="preserve">Status: </w:t>
       </w:r>
       <w:r>
@@ -313,11 +334,11 @@
         <w:t xml:space="preserve">Description: </w:t>
       </w:r>
       <w:r>
-        <w:t xml:space="preserve">The shared scaffolding reused by every individual pipeline. Covers: the durable BasePipelineOrchestrator framework and its StepSpec activity contract (ordered steps with prerequisites, invocation phase, timeout, parallelism spec, and completion marker), providing prerequisite gating, finally-block teardown that always fires on both success and failure paths, per-run failure-threshold abort, and skip-if-done step reuse keyed on source content hashes; the base Worker classes spawned as subprocesses and the MongoDB work-items coordination substrate with atomic findOneAndUpdate claims, heartbeats, and lease reclaim (no queues, no inter-process ports); the single authenticated entrance (Invoke) that admits a run and writes a fresh run manifest; the run manifest as the durable state-of-record and monitoring surface; common source-freshness gating (never trusting age) and content-hash-verified source fetching honoring vendor rate limits; the version-addressed source archive with prior-version retention; </w:t>
+        <w:t xml:space="preserve">The shared scaffolding reused by every individual pipeline. Covers: the durable BasePipelineOrchestrator framework and its StepSpec activity contract (ordered steps with prerequisites, invocation phase, timeout, parallelism spec, and completion marker), providing prerequisite gating, finally-block teardown that always fires on both success and failure paths, per-run failure-threshold abort, and skip-if-done step reuse keyed on source content hashes; the base Worker classes spawned as subprocesses and the MongoDB work-items coordination </w:t>
       </w:r>
       <w:r>
         <w:lastRenderedPageBreak/>
-        <w:t>and post-load source-vs-DB reconciliation with discrepancy persistence and run-end notifications. Realized by the framework and cross-cutting mechanisms in the Provider Pipeline LLD v33 (sections 5.1, 5.2.1, 5.2.3-5.2.5, 5.2.18-5.2.19, 4.3.2-4.3.5, chapters 6 and 8).</w:t>
+        <w:t>substrate with atomic findOneAndUpdate claims, heartbeats, and lease reclaim (no queues, no inter-process ports); the single authenticated entrance (Invoke) that admits a run and writes a fresh run manifest; the run manifest as the durable state-of-record and monitoring surface; common source-freshness gating (never trusting age) and content-hash-verified source fetching honoring vendor rate limits; the version-addressed source archive with prior-version retention; and post-load source-vs-DB reconciliation with discrepancy persistence and run-end notifications. Realized by the framework and cross-cutting mechanisms in the Provider Pipeline LLD v33 (sections 5.1, 5.2.1, 5.2.3-5.2.5, 5.2.18-5.2.19, 4.3.2-4.3.5, chapters 6 and 8).</w:t>
       </w:r>
     </w:p>
     <w:p>
@@ -468,14 +489,11 @@
         <w:rPr>
           <w:b/>
         </w:rPr>
+        <w:lastRenderedPageBreak/>
         <w:t xml:space="preserve">Description: </w:t>
       </w:r>
       <w:r>
-        <w:t>End-to-end load of the specialty record consumed by FindCare, produced as {env}_PublicHealthData.SpecialtyMetaData on the front-end cluster. A sibling pipeline that reuses the shared substrate (F-101 infrastructure and F-102 orchestration) and consumes the F-</w:t>
-      </w:r>
-      <w:r>
-        <w:lastRenderedPageBreak/>
-        <w:t>105 proprietary flags catalog. Out of scope for the Provider Pipeline LLD v33 (it carries its own low-level design); listed here for epic completeness.</w:t>
+        <w:t>End-to-end load of the specialty record consumed by FindCare, produced as {env}_PublicHealthData.SpecialtyMetaData on the front-end cluster. A sibling pipeline that reuses the shared substrate (F-101 infrastructure and F-102 orchestration) and consumes the F-105 proprietary flags catalog. Out of scope for the Provider Pipeline LLD v33 (it carries its own low-level design); listed here for epic completeness.</w:t>
       </w:r>
     </w:p>
     <w:p>
@@ -670,6 +688,7 @@
         <w:rPr>
           <w:b/>
         </w:rPr>
+        <w:lastRenderedPageBreak/>
         <w:t xml:space="preserve">Approval: </w:t>
       </w:r>
       <w:r>
@@ -692,7 +711,6 @@
         <w:rPr>
           <w:b/>
         </w:rPr>
-        <w:lastRenderedPageBreak/>
         <w:t xml:space="preserve">Realized by: </w:t>
       </w:r>
       <w:r>

</xml_diff>